<commit_message>
add eng version file. update README
</commit_message>
<xml_diff>
--- a/Docs/Test_Plan.docx
+++ b/Docs/Test_Plan.docx
@@ -1040,6 +1040,64 @@
         </w:rPr>
         <w:t xml:space="preserve">Тестовий набір: </w:t>
       </w:r>
+      <w:r>
+        <w:rPr>
+          <w:rFonts w:ascii="Times New Roman" w:hAnsi="Times New Roman" w:cs="Times New Roman"/>
+          <w:sz w:val="28"/>
+          <w:szCs w:val="28"/>
+        </w:rPr>
+        <w:t xml:space="preserve">файл </w:t>
+      </w:r>
+      <w:r>
+        <w:rPr>
+          <w:rFonts w:ascii="Times New Roman" w:hAnsi="Times New Roman" w:cs="Times New Roman"/>
+          <w:sz w:val="28"/>
+          <w:szCs w:val="28"/>
+        </w:rPr>
+        <w:t>Test_Suite.xlsx</w:t>
+      </w:r>
+      <w:r>
+        <w:rPr>
+          <w:rFonts w:ascii="Times New Roman" w:hAnsi="Times New Roman" w:cs="Times New Roman"/>
+          <w:sz w:val="28"/>
+          <w:szCs w:val="28"/>
+        </w:rPr>
+        <w:t xml:space="preserve"> лист з назвою </w:t>
+      </w:r>
+      <w:r>
+        <w:rPr>
+          <w:rFonts w:ascii="Times New Roman" w:hAnsi="Times New Roman" w:cs="Times New Roman"/>
+          <w:sz w:val="28"/>
+          <w:szCs w:val="28"/>
+          <w:lang w:val="en-US"/>
+        </w:rPr>
+        <w:t>test</w:t>
+      </w:r>
+      <w:r>
+        <w:rPr>
+          <w:rFonts w:ascii="Times New Roman" w:hAnsi="Times New Roman" w:cs="Times New Roman"/>
+          <w:sz w:val="28"/>
+          <w:szCs w:val="28"/>
+        </w:rPr>
+        <w:t xml:space="preserve"> </w:t>
+      </w:r>
+      <w:r>
+        <w:rPr>
+          <w:rFonts w:ascii="Times New Roman" w:hAnsi="Times New Roman" w:cs="Times New Roman"/>
+          <w:sz w:val="28"/>
+          <w:szCs w:val="28"/>
+          <w:lang w:val="en-US"/>
+        </w:rPr>
+        <w:t>suite</w:t>
+      </w:r>
+      <w:r>
+        <w:rPr>
+          <w:rFonts w:ascii="Times New Roman" w:hAnsi="Times New Roman" w:cs="Times New Roman"/>
+          <w:sz w:val="28"/>
+          <w:szCs w:val="28"/>
+        </w:rPr>
+        <w:t>.</w:t>
+      </w:r>
     </w:p>
     <w:p>
       <w:pPr>
@@ -1062,7 +1120,56 @@
           <w:sz w:val="28"/>
           <w:szCs w:val="28"/>
         </w:rPr>
-        <w:t>Чек лист :</w:t>
+        <w:t>Чек лист:</w:t>
+      </w:r>
+      <w:r>
+        <w:rPr>
+          <w:rFonts w:ascii="Times New Roman" w:hAnsi="Times New Roman" w:cs="Times New Roman"/>
+          <w:sz w:val="28"/>
+          <w:szCs w:val="28"/>
+        </w:rPr>
+        <w:t xml:space="preserve"> </w:t>
+      </w:r>
+      <w:r>
+        <w:rPr>
+          <w:rFonts w:ascii="Times New Roman" w:hAnsi="Times New Roman" w:cs="Times New Roman"/>
+          <w:sz w:val="28"/>
+          <w:szCs w:val="28"/>
+        </w:rPr>
+        <w:t xml:space="preserve">файл </w:t>
+      </w:r>
+      <w:r>
+        <w:rPr>
+          <w:rFonts w:ascii="Times New Roman" w:hAnsi="Times New Roman" w:cs="Times New Roman"/>
+          <w:sz w:val="28"/>
+          <w:szCs w:val="28"/>
+        </w:rPr>
+        <w:t>Test_Suite.xlsx</w:t>
+      </w:r>
+      <w:r>
+        <w:rPr>
+          <w:rFonts w:ascii="Times New Roman" w:hAnsi="Times New Roman" w:cs="Times New Roman"/>
+          <w:sz w:val="28"/>
+          <w:szCs w:val="28"/>
+        </w:rPr>
+        <w:t xml:space="preserve"> лист з назвою </w:t>
+      </w:r>
+      <w:r>
+        <w:rPr>
+          <w:rFonts w:ascii="Times New Roman" w:hAnsi="Times New Roman" w:cs="Times New Roman"/>
+          <w:sz w:val="28"/>
+          <w:szCs w:val="28"/>
+          <w:lang w:val="en-US"/>
+        </w:rPr>
+        <w:t>Check List</w:t>
+      </w:r>
+      <w:r>
+        <w:rPr>
+          <w:rFonts w:ascii="Times New Roman" w:hAnsi="Times New Roman" w:cs="Times New Roman"/>
+          <w:sz w:val="28"/>
+          <w:szCs w:val="28"/>
+        </w:rPr>
+        <w:t>.</w:t>
       </w:r>
     </w:p>
     <w:p>
@@ -1086,7 +1193,40 @@
           <w:sz w:val="28"/>
           <w:szCs w:val="28"/>
         </w:rPr>
-        <w:t xml:space="preserve">Баги : </w:t>
+        <w:t xml:space="preserve">Баги: </w:t>
+      </w:r>
+      <w:r>
+        <w:rPr>
+          <w:rFonts w:ascii="Times New Roman" w:hAnsi="Times New Roman" w:cs="Times New Roman"/>
+          <w:sz w:val="28"/>
+          <w:szCs w:val="28"/>
+        </w:rPr>
+        <w:t xml:space="preserve">файл </w:t>
+      </w:r>
+      <w:r>
+        <w:rPr>
+          <w:rFonts w:ascii="Times New Roman" w:hAnsi="Times New Roman" w:cs="Times New Roman"/>
+          <w:sz w:val="28"/>
+          <w:szCs w:val="28"/>
+        </w:rPr>
+        <w:t>Test_Suite.xlsx</w:t>
+      </w:r>
+      <w:r>
+        <w:rPr>
+          <w:rFonts w:ascii="Times New Roman" w:hAnsi="Times New Roman" w:cs="Times New Roman"/>
+          <w:sz w:val="28"/>
+          <w:szCs w:val="28"/>
+        </w:rPr>
+        <w:t xml:space="preserve"> лист з назвою </w:t>
+      </w:r>
+      <w:r>
+        <w:rPr>
+          <w:rFonts w:ascii="Times New Roman" w:hAnsi="Times New Roman" w:cs="Times New Roman"/>
+          <w:sz w:val="28"/>
+          <w:szCs w:val="28"/>
+          <w:lang w:val="en-US"/>
+        </w:rPr>
+        <w:t>Bugs.</w:t>
       </w:r>
     </w:p>
     <w:sectPr>

</xml_diff>